<commit_message>
Release 1.28.0 — MMC corporation support, generic corporation branding in templates, tender-scan hang fix, collapsible Settings sections
Co-Authored-By: Claude Sonnet 5 <noreply@anthropic.com>
</commit_message>
<xml_diff>
--- a/resources/agreement-template-kompally.docx
+++ b/resources/agreement-template-kompally.docx
@@ -538,7 +538,7 @@
           <w:b/>
           <w:bCs/>
         </w:rPr>
-        <w:t xml:space="preserve">{{Agency Name}}, {{Address of the agency}} herewith styled the contractor, in consideration for an Amount of     {{Contract value}} (Rupees {{Contract value in rupees}}) is to be paid to me by the Committee / Commissioner of Cyberabad Municipal Corporation here by agree to perform and carry out the work of “{{Name of the work}}</w:t>
+        <w:t xml:space="preserve">{{Agency Name}}, {{Address of the agency}} herewith styled the contractor, in consideration for an Amount of     {{Contract value}} (Rupees {{Contract value in rupees}}) is to be paid to me by the Committee / Commissioner of {{Corp Full}} here by agree to perform and carry out the work of “{{Name of the work}}</w:t>
       </w:r>
       <w:r>
         <w:rPr>
@@ -888,14 +888,14 @@
           <w:rFonts w:ascii="Tahoma" w:hAnsi="Tahoma" w:cs="Tahoma"/>
           <w:bCs/>
         </w:rPr>
-        <w:t>C</w:t>
-      </w:r>
-      <w:r>
-        <w:rPr>
-          <w:rFonts w:ascii="Tahoma" w:hAnsi="Tahoma" w:cs="Tahoma"/>
-          <w:bCs/>
-        </w:rPr>
-        <w:t>MC</w:t>
+        <w:t>{{Corporation}}</w:t>
+      </w:r>
+      <w:r>
+        <w:rPr>
+          <w:rFonts w:ascii="Tahoma" w:hAnsi="Tahoma" w:cs="Tahoma"/>
+          <w:bCs/>
+        </w:rPr>
+        <w:t/>
       </w:r>
       <w:r>
         <w:rPr>
@@ -1157,7 +1157,7 @@
           <w:sz w:val="20"/>
           <w:lang w:val="en-IN"/>
         </w:rPr>
-        <w:t xml:space="preserve">{{CNO}}, CMC, {{Circle}}</w:t>
+        <w:t xml:space="preserve">{{CNO}}, {{Corporation}}, {{Circle}}</w:t>
       </w:r>
       <w:r>
         <w:rPr>

</xml_diff>